<commit_message>
Remove unnecessary characters and clean up code
</commit_message>
<xml_diff>
--- a/Lab1_2/ТаблицаИстинностиDecoder.docx
+++ b/Lab1_2/ТаблицаИстинностиDecoder.docx
@@ -4,6 +4,7 @@
   <w:body>
     <w:tbl>
       <w:tblPr>
+        <w:tblStyle w:val="3"/>
         <w:tblW w:w="0" w:type="auto"/>
         <w:tblCellSpacing w:w="15" w:type="dxa"/>
         <w:tblInd w:w="15" w:type="dxa"/>
@@ -15,7 +16,7 @@
           <w:insideH w:val="none" w:color="auto" w:sz="0" w:space="0"/>
           <w:insideV w:val="none" w:color="auto" w:sz="0" w:space="0"/>
         </w:tblBorders>
-        <w:shd w:val="clear"/>
+        <w:shd w:val="clear" w:color="auto" w:fill="auto"/>
         <w:tblLayout w:type="autofit"/>
         <w:tblCellMar>
           <w:top w:w="0" w:type="dxa"/>
@@ -26,7 +27,7 @@
       </w:tblPr>
       <w:tblGrid>
         <w:gridCol w:w="1300"/>
-        <w:gridCol w:w="997"/>
+        <w:gridCol w:w="1261"/>
         <w:gridCol w:w="1300"/>
       </w:tblGrid>
       <w:tr>
@@ -39,6 +40,7 @@
             <w:insideH w:val="none" w:color="auto" w:sz="0" w:space="0"/>
             <w:insideV w:val="none" w:color="auto" w:sz="0" w:space="0"/>
           </w:tblBorders>
+          <w:shd w:val="clear" w:color="auto" w:fill="auto"/>
           <w:tblCellMar>
             <w:top w:w="0" w:type="dxa"/>
             <w:left w:w="0" w:type="dxa"/>
@@ -59,7 +61,7 @@
               <w:bottom w:val="single" w:color="C4C7C5" w:sz="6" w:space="0"/>
               <w:right w:val="single" w:color="C4C7C5" w:sz="6" w:space="0"/>
             </w:tcBorders>
-            <w:shd w:val="clear"/>
+            <w:shd w:val="clear" w:color="auto" w:fill="auto"/>
             <w:tcMar>
               <w:top w:w="120" w:type="dxa"/>
               <w:left w:w="180" w:type="dxa"/>
@@ -91,7 +93,6 @@
                 <w:kern w:val="0"/>
                 <w:sz w:val="24"/>
                 <w:szCs w:val="24"/>
-                <w:bdr w:val="none" w:color="1F1F1F" w:sz="0" w:space="0"/>
                 <w:lang w:val="en-US" w:eastAsia="zh-CN" w:bidi="ar"/>
               </w:rPr>
               <w:t>enable</w:t>
@@ -107,7 +108,7 @@
               <w:bottom w:val="single" w:color="C4C7C5" w:sz="6" w:space="0"/>
               <w:right w:val="single" w:color="C4C7C5" w:sz="6" w:space="0"/>
             </w:tcBorders>
-            <w:shd w:val="clear"/>
+            <w:shd w:val="clear" w:color="auto" w:fill="auto"/>
             <w:tcMar>
               <w:top w:w="120" w:type="dxa"/>
               <w:left w:w="180" w:type="dxa"/>
@@ -139,7 +140,6 @@
                 <w:kern w:val="0"/>
                 <w:sz w:val="24"/>
                 <w:szCs w:val="24"/>
-                <w:bdr w:val="none" w:color="1F1F1F" w:sz="0" w:space="0"/>
                 <w:lang w:val="en-US" w:eastAsia="zh-CN" w:bidi="ar"/>
               </w:rPr>
               <w:t>code</w:t>
@@ -155,7 +155,7 @@
               <w:bottom w:val="single" w:color="C4C7C5" w:sz="6" w:space="0"/>
               <w:right w:val="single" w:color="C4C7C5" w:sz="6" w:space="0"/>
             </w:tcBorders>
-            <w:shd w:val="clear"/>
+            <w:shd w:val="clear" w:color="auto" w:fill="auto"/>
             <w:tcMar>
               <w:top w:w="120" w:type="dxa"/>
               <w:left w:w="180" w:type="dxa"/>
@@ -187,13 +187,10 @@
                 <w:kern w:val="0"/>
                 <w:sz w:val="24"/>
                 <w:szCs w:val="24"/>
-                <w:bdr w:val="none" w:color="1F1F1F" w:sz="0" w:space="0"/>
                 <w:lang w:val="en-US" w:eastAsia="zh-CN" w:bidi="ar"/>
               </w:rPr>
               <w:t>onehot</w:t>
             </w:r>
-            <w:bookmarkStart w:id="0" w:name="_GoBack"/>
-            <w:bookmarkEnd w:id="0"/>
           </w:p>
         </w:tc>
       </w:tr>
@@ -207,6 +204,7 @@
             <w:insideH w:val="none" w:color="auto" w:sz="0" w:space="0"/>
             <w:insideV w:val="none" w:color="auto" w:sz="0" w:space="0"/>
           </w:tblBorders>
+          <w:shd w:val="clear" w:color="auto" w:fill="auto"/>
           <w:tblCellMar>
             <w:top w:w="0" w:type="dxa"/>
             <w:left w:w="0" w:type="dxa"/>
@@ -226,7 +224,7 @@
               <w:bottom w:val="single" w:color="C4C7C5" w:sz="6" w:space="0"/>
               <w:right w:val="single" w:color="C4C7C5" w:sz="6" w:space="0"/>
             </w:tcBorders>
-            <w:shd w:val="clear"/>
+            <w:shd w:val="clear" w:color="auto" w:fill="auto"/>
             <w:tcMar>
               <w:top w:w="120" w:type="dxa"/>
               <w:left w:w="180" w:type="dxa"/>
@@ -262,7 +260,6 @@
                 <w:kern w:val="0"/>
                 <w:sz w:val="22"/>
                 <w:szCs w:val="22"/>
-                <w:bdr w:val="none" w:color="auto" w:sz="0" w:space="0"/>
                 <w:lang w:val="en-US" w:eastAsia="zh-CN" w:bidi="ar"/>
               </w:rPr>
               <w:t>0</w:t>
@@ -278,7 +275,53 @@
               <w:bottom w:val="single" w:color="C4C7C5" w:sz="6" w:space="0"/>
               <w:right w:val="single" w:color="C4C7C5" w:sz="6" w:space="0"/>
             </w:tcBorders>
-            <w:shd w:val="clear"/>
+            <w:shd w:val="clear" w:color="auto" w:fill="auto"/>
+            <w:tcMar>
+              <w:top w:w="120" w:type="dxa"/>
+              <w:left w:w="180" w:type="dxa"/>
+              <w:bottom w:w="120" w:type="dxa"/>
+              <w:right w:w="180" w:type="dxa"/>
+            </w:tcMar>
+            <w:vAlign w:val="center"/>
+          </w:tcPr>
+          <w:p>
+            <w:pPr>
+              <w:keepNext w:val="0"/>
+              <w:keepLines w:val="0"/>
+              <w:widowControl/>
+              <w:suppressLineNumbers w:val="0"/>
+              <w:bidi w:val="0"/>
+              <w:spacing w:before="0" w:beforeAutospacing="0" w:after="0" w:afterAutospacing="0" w:line="15" w:lineRule="atLeast"/>
+              <w:ind w:left="0" w:right="0"/>
+              <w:jc w:val="left"/>
+              <w:rPr>
+                <w:rFonts w:hint="default" w:ascii="sans-serif" w:hAnsi="sans-serif" w:eastAsia="sans-serif" w:cs="sans-serif"/>
+                <w:color w:val="1F1F1F"/>
+                <w:lang w:val="ru-RU"/>
+              </w:rPr>
+            </w:pPr>
+            <w:r>
+              <w:rPr>
+                <w:rFonts w:hint="default" w:ascii="sans-serif" w:hAnsi="sans-serif" w:eastAsia="sans-serif" w:cs="sans-serif"/>
+                <w:color w:val="1F1F1F"/>
+                <w:lang w:val="ru-RU"/>
+              </w:rPr>
+              <w:t>Неважно</w:t>
+            </w:r>
+            <w:bookmarkStart w:id="0" w:name="_GoBack"/>
+            <w:bookmarkEnd w:id="0"/>
+          </w:p>
+        </w:tc>
+        <w:tc>
+          <w:tcPr>
+            <w:tcW w:w="0" w:type="auto"/>
+            <w:tcBorders>
+              <w:top w:val="single" w:color="C4C7C5" w:sz="6" w:space="0"/>
+              <w:left w:val="single" w:color="C4C7C5" w:sz="6" w:space="0"/>
+              <w:bottom w:val="single" w:color="C4C7C5" w:sz="6" w:space="0"/>
+              <w:right w:val="single" w:color="C4C7C5" w:sz="6" w:space="0"/>
+            </w:tcBorders>
+            <w:shd w:val="clear" w:color="auto" w:fill="auto"/>
             <w:tcMar>
               <w:top w:w="120" w:type="dxa"/>
               <w:left w:w="180" w:type="dxa"/>
@@ -314,59 +357,6 @@
                 <w:kern w:val="0"/>
                 <w:sz w:val="22"/>
                 <w:szCs w:val="22"/>
-                <w:bdr w:val="none" w:color="auto" w:sz="0" w:space="0"/>
-                <w:lang w:val="en-US" w:eastAsia="zh-CN" w:bidi="ar"/>
-              </w:rPr>
-              <w:t>XX</w:t>
-            </w:r>
-          </w:p>
-        </w:tc>
-        <w:tc>
-          <w:tcPr>
-            <w:tcW w:w="0" w:type="auto"/>
-            <w:tcBorders>
-              <w:top w:val="single" w:color="C4C7C5" w:sz="6" w:space="0"/>
-              <w:left w:val="single" w:color="C4C7C5" w:sz="6" w:space="0"/>
-              <w:bottom w:val="single" w:color="C4C7C5" w:sz="6" w:space="0"/>
-              <w:right w:val="single" w:color="C4C7C5" w:sz="6" w:space="0"/>
-            </w:tcBorders>
-            <w:shd w:val="clear"/>
-            <w:tcMar>
-              <w:top w:w="120" w:type="dxa"/>
-              <w:left w:w="180" w:type="dxa"/>
-              <w:bottom w:w="120" w:type="dxa"/>
-              <w:right w:w="180" w:type="dxa"/>
-            </w:tcMar>
-            <w:vAlign w:val="center"/>
-          </w:tcPr>
-          <w:p>
-            <w:pPr>
-              <w:keepNext w:val="0"/>
-              <w:keepLines w:val="0"/>
-              <w:widowControl/>
-              <w:suppressLineNumbers w:val="0"/>
-              <w:bidi w:val="0"/>
-              <w:spacing w:before="0" w:beforeAutospacing="0" w:after="0" w:afterAutospacing="0" w:line="15" w:lineRule="atLeast"/>
-              <w:ind w:left="0" w:right="0"/>
-              <w:jc w:val="left"/>
-              <w:rPr>
-                <w:rFonts w:hint="default" w:ascii="sans-serif" w:hAnsi="sans-serif" w:eastAsia="sans-serif" w:cs="sans-serif"/>
-                <w:color w:val="1F1F1F"/>
-              </w:rPr>
-            </w:pPr>
-            <w:r>
-              <w:rPr>
-                <w:rStyle w:val="4"/>
-                <w:rFonts w:hint="default" w:ascii="sans-serif" w:hAnsi="sans-serif" w:eastAsia="sans-serif" w:cs="sans-serif"/>
-                <w:b w:val="0"/>
-                <w:bCs w:val="0"/>
-                <w:i w:val="0"/>
-                <w:iCs w:val="0"/>
-                <w:color w:val="1F1F1F"/>
-                <w:kern w:val="0"/>
-                <w:sz w:val="22"/>
-                <w:szCs w:val="22"/>
-                <w:bdr w:val="none" w:color="auto" w:sz="0" w:space="0"/>
                 <w:lang w:val="en-US" w:eastAsia="zh-CN" w:bidi="ar"/>
               </w:rPr>
               <w:t>0000</w:t>
@@ -384,7 +374,7 @@
             <w:insideH w:val="none" w:color="auto" w:sz="0" w:space="0"/>
             <w:insideV w:val="none" w:color="auto" w:sz="0" w:space="0"/>
           </w:tblBorders>
-          <w:shd w:val="clear"/>
+          <w:shd w:val="clear" w:color="auto" w:fill="auto"/>
           <w:tblCellMar>
             <w:top w:w="0" w:type="dxa"/>
             <w:left w:w="0" w:type="dxa"/>
@@ -404,7 +394,7 @@
               <w:bottom w:val="single" w:color="C4C7C5" w:sz="6" w:space="0"/>
               <w:right w:val="single" w:color="C4C7C5" w:sz="6" w:space="0"/>
             </w:tcBorders>
-            <w:shd w:val="clear"/>
+            <w:shd w:val="clear" w:color="auto" w:fill="auto"/>
             <w:tcMar>
               <w:top w:w="120" w:type="dxa"/>
               <w:left w:w="180" w:type="dxa"/>
@@ -440,7 +430,6 @@
                 <w:kern w:val="0"/>
                 <w:sz w:val="22"/>
                 <w:szCs w:val="22"/>
-                <w:bdr w:val="none" w:color="auto" w:sz="0" w:space="0"/>
                 <w:lang w:val="en-US" w:eastAsia="zh-CN" w:bidi="ar"/>
               </w:rPr>
               <w:t>1</w:t>
@@ -456,7 +445,7 @@
               <w:bottom w:val="single" w:color="C4C7C5" w:sz="6" w:space="0"/>
               <w:right w:val="single" w:color="C4C7C5" w:sz="6" w:space="0"/>
             </w:tcBorders>
-            <w:shd w:val="clear"/>
+            <w:shd w:val="clear" w:color="auto" w:fill="auto"/>
             <w:tcMar>
               <w:top w:w="120" w:type="dxa"/>
               <w:left w:w="180" w:type="dxa"/>
@@ -492,7 +481,6 @@
                 <w:kern w:val="0"/>
                 <w:sz w:val="22"/>
                 <w:szCs w:val="22"/>
-                <w:bdr w:val="none" w:color="auto" w:sz="0" w:space="0"/>
                 <w:lang w:val="en-US" w:eastAsia="zh-CN" w:bidi="ar"/>
               </w:rPr>
               <w:t>00</w:t>
@@ -508,7 +496,7 @@
               <w:bottom w:val="single" w:color="C4C7C5" w:sz="6" w:space="0"/>
               <w:right w:val="single" w:color="C4C7C5" w:sz="6" w:space="0"/>
             </w:tcBorders>
-            <w:shd w:val="clear"/>
+            <w:shd w:val="clear" w:color="auto" w:fill="auto"/>
             <w:tcMar>
               <w:top w:w="120" w:type="dxa"/>
               <w:left w:w="180" w:type="dxa"/>
@@ -544,7 +532,6 @@
                 <w:kern w:val="0"/>
                 <w:sz w:val="22"/>
                 <w:szCs w:val="22"/>
-                <w:bdr w:val="none" w:color="auto" w:sz="0" w:space="0"/>
                 <w:lang w:val="en-US" w:eastAsia="zh-CN" w:bidi="ar"/>
               </w:rPr>
               <w:t>0001</w:t>
@@ -562,7 +549,7 @@
             <w:insideH w:val="none" w:color="auto" w:sz="0" w:space="0"/>
             <w:insideV w:val="none" w:color="auto" w:sz="0" w:space="0"/>
           </w:tblBorders>
-          <w:shd w:val="clear"/>
+          <w:shd w:val="clear" w:color="auto" w:fill="auto"/>
           <w:tblCellMar>
             <w:top w:w="0" w:type="dxa"/>
             <w:left w:w="0" w:type="dxa"/>
@@ -582,7 +569,7 @@
               <w:bottom w:val="single" w:color="C4C7C5" w:sz="6" w:space="0"/>
               <w:right w:val="single" w:color="C4C7C5" w:sz="6" w:space="0"/>
             </w:tcBorders>
-            <w:shd w:val="clear"/>
+            <w:shd w:val="clear" w:color="auto" w:fill="auto"/>
             <w:tcMar>
               <w:top w:w="120" w:type="dxa"/>
               <w:left w:w="180" w:type="dxa"/>
@@ -618,7 +605,6 @@
                 <w:kern w:val="0"/>
                 <w:sz w:val="22"/>
                 <w:szCs w:val="22"/>
-                <w:bdr w:val="none" w:color="auto" w:sz="0" w:space="0"/>
                 <w:lang w:val="en-US" w:eastAsia="zh-CN" w:bidi="ar"/>
               </w:rPr>
               <w:t>1</w:t>
@@ -634,7 +620,7 @@
               <w:bottom w:val="single" w:color="C4C7C5" w:sz="6" w:space="0"/>
               <w:right w:val="single" w:color="C4C7C5" w:sz="6" w:space="0"/>
             </w:tcBorders>
-            <w:shd w:val="clear"/>
+            <w:shd w:val="clear" w:color="auto" w:fill="auto"/>
             <w:tcMar>
               <w:top w:w="120" w:type="dxa"/>
               <w:left w:w="180" w:type="dxa"/>
@@ -670,7 +656,6 @@
                 <w:kern w:val="0"/>
                 <w:sz w:val="22"/>
                 <w:szCs w:val="22"/>
-                <w:bdr w:val="none" w:color="auto" w:sz="0" w:space="0"/>
                 <w:lang w:val="en-US" w:eastAsia="zh-CN" w:bidi="ar"/>
               </w:rPr>
               <w:t>01</w:t>
@@ -686,7 +671,7 @@
               <w:bottom w:val="single" w:color="C4C7C5" w:sz="6" w:space="0"/>
               <w:right w:val="single" w:color="C4C7C5" w:sz="6" w:space="0"/>
             </w:tcBorders>
-            <w:shd w:val="clear"/>
+            <w:shd w:val="clear" w:color="auto" w:fill="auto"/>
             <w:tcMar>
               <w:top w:w="120" w:type="dxa"/>
               <w:left w:w="180" w:type="dxa"/>
@@ -722,7 +707,6 @@
                 <w:kern w:val="0"/>
                 <w:sz w:val="22"/>
                 <w:szCs w:val="22"/>
-                <w:bdr w:val="none" w:color="auto" w:sz="0" w:space="0"/>
                 <w:lang w:val="en-US" w:eastAsia="zh-CN" w:bidi="ar"/>
               </w:rPr>
               <w:t>0010</w:t>
@@ -740,7 +724,7 @@
             <w:insideH w:val="none" w:color="auto" w:sz="0" w:space="0"/>
             <w:insideV w:val="none" w:color="auto" w:sz="0" w:space="0"/>
           </w:tblBorders>
-          <w:shd w:val="clear"/>
+          <w:shd w:val="clear" w:color="auto" w:fill="auto"/>
           <w:tblCellMar>
             <w:top w:w="0" w:type="dxa"/>
             <w:left w:w="0" w:type="dxa"/>
@@ -760,7 +744,7 @@
               <w:bottom w:val="single" w:color="C4C7C5" w:sz="6" w:space="0"/>
               <w:right w:val="single" w:color="C4C7C5" w:sz="6" w:space="0"/>
             </w:tcBorders>
-            <w:shd w:val="clear"/>
+            <w:shd w:val="clear" w:color="auto" w:fill="auto"/>
             <w:tcMar>
               <w:top w:w="120" w:type="dxa"/>
               <w:left w:w="180" w:type="dxa"/>
@@ -796,7 +780,6 @@
                 <w:kern w:val="0"/>
                 <w:sz w:val="22"/>
                 <w:szCs w:val="22"/>
-                <w:bdr w:val="none" w:color="auto" w:sz="0" w:space="0"/>
                 <w:lang w:val="en-US" w:eastAsia="zh-CN" w:bidi="ar"/>
               </w:rPr>
               <w:t>1</w:t>
@@ -812,7 +795,7 @@
               <w:bottom w:val="single" w:color="C4C7C5" w:sz="6" w:space="0"/>
               <w:right w:val="single" w:color="C4C7C5" w:sz="6" w:space="0"/>
             </w:tcBorders>
-            <w:shd w:val="clear"/>
+            <w:shd w:val="clear" w:color="auto" w:fill="auto"/>
             <w:tcMar>
               <w:top w:w="120" w:type="dxa"/>
               <w:left w:w="180" w:type="dxa"/>
@@ -848,7 +831,6 @@
                 <w:kern w:val="0"/>
                 <w:sz w:val="22"/>
                 <w:szCs w:val="22"/>
-                <w:bdr w:val="none" w:color="auto" w:sz="0" w:space="0"/>
                 <w:lang w:val="en-US" w:eastAsia="zh-CN" w:bidi="ar"/>
               </w:rPr>
               <w:t>10</w:t>
@@ -864,7 +846,7 @@
               <w:bottom w:val="single" w:color="C4C7C5" w:sz="6" w:space="0"/>
               <w:right w:val="single" w:color="C4C7C5" w:sz="6" w:space="0"/>
             </w:tcBorders>
-            <w:shd w:val="clear"/>
+            <w:shd w:val="clear" w:color="auto" w:fill="auto"/>
             <w:tcMar>
               <w:top w:w="120" w:type="dxa"/>
               <w:left w:w="180" w:type="dxa"/>
@@ -900,7 +882,6 @@
                 <w:kern w:val="0"/>
                 <w:sz w:val="22"/>
                 <w:szCs w:val="22"/>
-                <w:bdr w:val="none" w:color="auto" w:sz="0" w:space="0"/>
                 <w:lang w:val="en-US" w:eastAsia="zh-CN" w:bidi="ar"/>
               </w:rPr>
               <w:t>0100</w:t>
@@ -918,6 +899,7 @@
             <w:insideH w:val="none" w:color="auto" w:sz="0" w:space="0"/>
             <w:insideV w:val="none" w:color="auto" w:sz="0" w:space="0"/>
           </w:tblBorders>
+          <w:shd w:val="clear" w:color="auto" w:fill="auto"/>
           <w:tblCellMar>
             <w:top w:w="0" w:type="dxa"/>
             <w:left w:w="0" w:type="dxa"/>
@@ -937,7 +919,7 @@
               <w:bottom w:val="single" w:color="C4C7C5" w:sz="6" w:space="0"/>
               <w:right w:val="single" w:color="C4C7C5" w:sz="6" w:space="0"/>
             </w:tcBorders>
-            <w:shd w:val="clear"/>
+            <w:shd w:val="clear" w:color="auto" w:fill="auto"/>
             <w:tcMar>
               <w:top w:w="120" w:type="dxa"/>
               <w:left w:w="180" w:type="dxa"/>
@@ -973,7 +955,6 @@
                 <w:kern w:val="0"/>
                 <w:sz w:val="22"/>
                 <w:szCs w:val="22"/>
-                <w:bdr w:val="none" w:color="auto" w:sz="0" w:space="0"/>
                 <w:lang w:val="en-US" w:eastAsia="zh-CN" w:bidi="ar"/>
               </w:rPr>
               <w:t>1</w:t>
@@ -989,7 +970,7 @@
               <w:bottom w:val="single" w:color="C4C7C5" w:sz="6" w:space="0"/>
               <w:right w:val="single" w:color="C4C7C5" w:sz="6" w:space="0"/>
             </w:tcBorders>
-            <w:shd w:val="clear"/>
+            <w:shd w:val="clear" w:color="auto" w:fill="auto"/>
             <w:tcMar>
               <w:top w:w="120" w:type="dxa"/>
               <w:left w:w="180" w:type="dxa"/>
@@ -1025,7 +1006,6 @@
                 <w:kern w:val="0"/>
                 <w:sz w:val="22"/>
                 <w:szCs w:val="22"/>
-                <w:bdr w:val="none" w:color="auto" w:sz="0" w:space="0"/>
                 <w:lang w:val="en-US" w:eastAsia="zh-CN" w:bidi="ar"/>
               </w:rPr>
               <w:t>11</w:t>
@@ -1041,7 +1021,7 @@
               <w:bottom w:val="single" w:color="C4C7C5" w:sz="6" w:space="0"/>
               <w:right w:val="single" w:color="C4C7C5" w:sz="6" w:space="0"/>
             </w:tcBorders>
-            <w:shd w:val="clear"/>
+            <w:shd w:val="clear" w:color="auto" w:fill="auto"/>
             <w:tcMar>
               <w:top w:w="120" w:type="dxa"/>
               <w:left w:w="180" w:type="dxa"/>
@@ -1077,7 +1057,6 @@
                 <w:kern w:val="0"/>
                 <w:sz w:val="22"/>
                 <w:szCs w:val="22"/>
-                <w:bdr w:val="none" w:color="auto" w:sz="0" w:space="0"/>
                 <w:lang w:val="en-US" w:eastAsia="zh-CN" w:bidi="ar"/>
               </w:rPr>
               <w:t>1000</w:t>
@@ -1204,7 +1183,7 @@
     <w:lsdException w:unhideWhenUsed="0" w:uiPriority="0" w:semiHidden="0" w:name="HTML Acronym"/>
     <w:lsdException w:unhideWhenUsed="0" w:uiPriority="0" w:semiHidden="0" w:name="HTML Address"/>
     <w:lsdException w:unhideWhenUsed="0" w:uiPriority="0" w:semiHidden="0" w:name="HTML Cite"/>
-    <w:lsdException w:unhideWhenUsed="0" w:uiPriority="0" w:semiHidden="0" w:name="HTML Code"/>
+    <w:lsdException w:qFormat="1" w:unhideWhenUsed="0" w:uiPriority="0" w:semiHidden="0" w:name="HTML Code"/>
     <w:lsdException w:unhideWhenUsed="0" w:uiPriority="0" w:semiHidden="0" w:name="HTML Definition"/>
     <w:lsdException w:unhideWhenUsed="0" w:uiPriority="0" w:semiHidden="0" w:name="HTML Keyboard"/>
     <w:lsdException w:unhideWhenUsed="0" w:uiPriority="0" w:semiHidden="0" w:name="HTML Preformatted"/>
@@ -1291,6 +1270,7 @@
   <w:style w:type="character" w:styleId="4">
     <w:name w:val="HTML Code"/>
     <w:basedOn w:val="2"/>
+    <w:qFormat/>
     <w:uiPriority w:val="0"/>
     <w:rPr>
       <w:rFonts w:ascii="Courier New" w:hAnsi="Courier New" w:cs="Courier New"/>

</xml_diff>